<commit_message>
add lint for correct table numbering
</commit_message>
<xml_diff>
--- a/WordStyleCheck/rules.docx
+++ b/WordStyleCheck/rules.docx
@@ -595,19 +595,7 @@
         <w:rPr>
           <w:lang w:val="en-US"/>
         </w:rPr>
-        <w:t xml:space="preserve">Подписи к рисункам </w:t>
-      </w:r>
-      <w:r>
-        <w:rPr>
-          <w:lang w:val="en-US"/>
-        </w:rPr>
-        <w:t>и таблицам</w:t>
-      </w:r>
-      <w:r>
-        <w:rPr>
-          <w:lang w:val="en-US"/>
-        </w:rPr>
-        <w:t xml:space="preserve"> должны быть записаны через один межстрочный интервал.</w:t>
+        <w:t>Подписи к рисункам и таблицам должны быть записаны через один межстрочный интервал.</w:t>
       </w:r>
     </w:p>
     <w:p>
@@ -1486,6 +1474,109 @@
         <w:rPr>
           <w:lang w:val="en-US"/>
         </w:rPr>
+        <w:t>@END</w:t>
+      </w:r>
+    </w:p>
+    <w:p>
+      <w:pPr>
+        <w:pStyle w:val="Normal"/>
+        <w:bidi w:val="0"/>
+        <w:jc w:val="left"/>
+        <w:rPr>
+          <w:lang w:val="en-US"/>
+        </w:rPr>
+      </w:pPr>
+      <w:r>
+        <w:rPr>
+          <w:lang w:val="en-US"/>
+        </w:rPr>
+      </w:r>
+    </w:p>
+    <w:p>
+      <w:pPr>
+        <w:pStyle w:val="Normal"/>
+        <w:bidi w:val="0"/>
+        <w:jc w:val="left"/>
+        <w:rPr>
+          <w:lang w:val="en-US"/>
+        </w:rPr>
+      </w:pPr>
+      <w:r>
+        <w:rPr>
+          <w:lang w:val="en-US"/>
+        </w:rPr>
+        <w:t>@BEGIN Incorrect</w:t>
+      </w:r>
+      <w:r>
+        <w:rPr>
+          <w:lang w:val="en-US"/>
+        </w:rPr>
+        <w:t>TableN</w:t>
+      </w:r>
+      <w:r>
+        <w:rPr>
+          <w:lang w:val="en-US"/>
+        </w:rPr>
+        <w:t>umbering</w:t>
+      </w:r>
+    </w:p>
+    <w:p>
+      <w:pPr>
+        <w:pStyle w:val="Normal"/>
+        <w:bidi w:val="0"/>
+        <w:jc w:val="left"/>
+        <w:rPr>
+          <w:lang w:val="en-US"/>
+        </w:rPr>
+      </w:pPr>
+      <w:r>
+        <w:rPr>
+          <w:lang w:val="ru-RU"/>
+        </w:rPr>
+        <w:t>Таблицы</w:t>
+      </w:r>
+      <w:r>
+        <w:rPr>
+          <w:lang w:val="en-US"/>
+        </w:rPr>
+        <w:t xml:space="preserve"> нумеруются арабскими цифрами сквозной нумерацией. Правильный номер</w:t>
+      </w:r>
+      <w:r>
+        <w:rPr>
+          <w:lang w:val="ru-RU"/>
+        </w:rPr>
+        <w:t xml:space="preserve"> </w:t>
+      </w:r>
+      <w:r>
+        <w:rPr>
+          <w:lang w:val="ru-RU"/>
+        </w:rPr>
+        <w:t>таблицы</w:t>
+      </w:r>
+      <w:r>
+        <w:rPr>
+          <w:lang w:val="ru-RU"/>
+        </w:rPr>
+        <w:t xml:space="preserve"> —</w:t>
+      </w:r>
+      <w:r>
+        <w:rPr>
+          <w:lang w:val="en-US"/>
+        </w:rPr>
+        <w:t xml:space="preserve"> $Expected.</w:t>
+      </w:r>
+    </w:p>
+    <w:p>
+      <w:pPr>
+        <w:pStyle w:val="Normal"/>
+        <w:bidi w:val="0"/>
+        <w:jc w:val="left"/>
+        <w:rPr>
+          <w:lang w:val="en-US"/>
+        </w:rPr>
+      </w:pPr>
+      <w:r>
+        <w:rPr/>
         <w:t>@END</w:t>
       </w:r>
     </w:p>
@@ -1949,8 +2040,8 @@
       <w:lang w:val="ru-RU" w:eastAsia="zh-CN" w:bidi="hi-IN"/>
     </w:rPr>
   </w:style>
-  <w:style w:type="paragraph" w:styleId="Heading">
-    <w:name w:val="Heading"/>
+  <w:style w:type="paragraph" w:styleId="Style14">
+    <w:name w:val="Заголовок"/>
     <w:basedOn w:val="Normal"/>
     <w:next w:val="BodyText"/>
     <w:qFormat/>
@@ -1996,8 +2087,8 @@
       <w:szCs w:val="24"/>
     </w:rPr>
   </w:style>
-  <w:style w:type="paragraph" w:styleId="Index">
-    <w:name w:val="Index"/>
+  <w:style w:type="paragraph" w:styleId="Style15">
+    <w:name w:val="Указатель"/>
     <w:basedOn w:val="Normal"/>
     <w:qFormat/>
     <w:pPr>
@@ -2007,8 +2098,8 @@
       <w:rFonts w:cs="Noto Sans Devanagari"/>
     </w:rPr>
   </w:style>
-  <w:style w:type="paragraph" w:styleId="Style14">
-    <w:name w:val="Заголовок"/>
+  <w:style w:type="paragraph" w:styleId="user">
+    <w:name w:val="Заголовок (user)"/>
     <w:basedOn w:val="Normal"/>
     <w:next w:val="BodyText"/>
     <w:qFormat/>
@@ -2022,8 +2113,8 @@
       <w:szCs w:val="28"/>
     </w:rPr>
   </w:style>
-  <w:style w:type="paragraph" w:styleId="Style15">
-    <w:name w:val="Указатель"/>
+  <w:style w:type="paragraph" w:styleId="user1">
+    <w:name w:val="Указатель (user)"/>
     <w:basedOn w:val="Normal"/>
     <w:qFormat/>
     <w:pPr>
@@ -2044,37 +2135,37 @@
         <a:srgbClr val="000000"/>
       </a:dk1>
       <a:lt1>
-        <a:srgbClr val="FFFFFF"/>
+        <a:srgbClr val="ffffff"/>
       </a:lt1>
       <a:dk2>
         <a:srgbClr val="000000"/>
       </a:dk2>
       <a:lt2>
-        <a:srgbClr val="FFFFFF"/>
+        <a:srgbClr val="ffffff"/>
       </a:lt2>
       <a:accent1>
-        <a:srgbClr val="18A303"/>
+        <a:srgbClr val="18a303"/>
       </a:accent1>
       <a:accent2>
-        <a:srgbClr val="0369A3"/>
+        <a:srgbClr val="0369a3"/>
       </a:accent2>
       <a:accent3>
-        <a:srgbClr val="A33E03"/>
+        <a:srgbClr val="a33e03"/>
       </a:accent3>
       <a:accent4>
-        <a:srgbClr val="8E03A3"/>
+        <a:srgbClr val="8e03a3"/>
       </a:accent4>
       <a:accent5>
-        <a:srgbClr val="C99C00"/>
+        <a:srgbClr val="c99c00"/>
       </a:accent5>
       <a:accent6>
-        <a:srgbClr val="C9211E"/>
+        <a:srgbClr val="c9211e"/>
       </a:accent6>
       <a:hlink>
-        <a:srgbClr val="0000EE"/>
+        <a:srgbClr val="0000ee"/>
       </a:hlink>
       <a:folHlink>
-        <a:srgbClr val="551A8B"/>
+        <a:srgbClr val="551a8b"/>
       </a:folHlink>
     </a:clrScheme>
     <a:fontScheme name="Office">

</xml_diff>

<commit_message>
add lint for unreferenced tables
</commit_message>
<xml_diff>
--- a/WordStyleCheck/rules.docx
+++ b/WordStyleCheck/rules.docx
@@ -979,6 +979,109 @@
         <w:rPr>
           <w:lang w:val="en-US"/>
         </w:rPr>
+        <w:t xml:space="preserve">@BEGIN </w:t>
+      </w:r>
+      <w:r>
+        <w:rPr>
+          <w:lang w:val="en-US"/>
+        </w:rPr>
+        <w:t>Table</w:t>
+      </w:r>
+      <w:r>
+        <w:rPr>
+          <w:lang w:val="en-US"/>
+        </w:rPr>
+        <w:t>NotReferenced</w:t>
+      </w:r>
+    </w:p>
+    <w:p>
+      <w:pPr>
+        <w:pStyle w:val="Normal"/>
+        <w:bidi w:val="0"/>
+        <w:jc w:val="left"/>
+        <w:rPr>
+          <w:lang w:val="ru-RU"/>
+        </w:rPr>
+      </w:pPr>
+      <w:r>
+        <w:rPr>
+          <w:lang w:val="ru-RU"/>
+        </w:rPr>
+        <w:t>Таблица</w:t>
+      </w:r>
+      <w:r>
+        <w:rPr>
+          <w:lang w:val="ru-RU"/>
+        </w:rPr>
+        <w:t xml:space="preserve"> не был</w:t>
+      </w:r>
+      <w:r>
+        <w:rPr>
+          <w:lang w:val="ru-RU"/>
+        </w:rPr>
+        <w:t>а</w:t>
+      </w:r>
+      <w:r>
+        <w:rPr>
+          <w:lang w:val="ru-RU"/>
+        </w:rPr>
+        <w:t xml:space="preserve"> упомянут</w:t>
+      </w:r>
+      <w:r>
+        <w:rPr>
+          <w:lang w:val="ru-RU"/>
+        </w:rPr>
+        <w:t>а</w:t>
+      </w:r>
+      <w:r>
+        <w:rPr>
+          <w:lang w:val="ru-RU"/>
+        </w:rPr>
+        <w:t xml:space="preserve"> в тексте.</w:t>
+      </w:r>
+    </w:p>
+    <w:p>
+      <w:pPr>
+        <w:pStyle w:val="Normal"/>
+        <w:bidi w:val="0"/>
+        <w:jc w:val="left"/>
+        <w:rPr>
+          <w:lang w:val="en-US"/>
+        </w:rPr>
+      </w:pPr>
+      <w:r>
+        <w:rPr/>
+        <w:t>@END</w:t>
+      </w:r>
+    </w:p>
+    <w:p>
+      <w:pPr>
+        <w:pStyle w:val="Normal"/>
+        <w:bidi w:val="0"/>
+        <w:jc w:val="left"/>
+        <w:rPr>
+          <w:lang w:val="en-US"/>
+        </w:rPr>
+      </w:pPr>
+      <w:r>
+        <w:rPr>
+          <w:lang w:val="en-US"/>
+        </w:rPr>
+      </w:r>
+    </w:p>
+    <w:p>
+      <w:pPr>
+        <w:pStyle w:val="Normal"/>
+        <w:bidi w:val="0"/>
+        <w:jc w:val="left"/>
+        <w:rPr>
+          <w:lang w:val="en-US"/>
+        </w:rPr>
+      </w:pPr>
+      <w:r>
+        <w:rPr>
+          <w:lang w:val="en-US"/>
+        </w:rPr>
         <w:t>@BEGIN TextFontIncorrect</w:t>
       </w:r>
     </w:p>
@@ -1505,19 +1608,7 @@
         <w:rPr>
           <w:lang w:val="en-US"/>
         </w:rPr>
-        <w:t>@BEGIN Incorrect</w:t>
-      </w:r>
-      <w:r>
-        <w:rPr>
-          <w:lang w:val="en-US"/>
-        </w:rPr>
-        <w:t>TableN</w:t>
-      </w:r>
-      <w:r>
-        <w:rPr>
-          <w:lang w:val="en-US"/>
-        </w:rPr>
-        <w:t>umbering</w:t>
+        <w:t>@BEGIN IncorrectTableNumbering</w:t>
       </w:r>
     </w:p>
     <w:p>
@@ -1545,19 +1636,7 @@
         <w:rPr>
           <w:lang w:val="ru-RU"/>
         </w:rPr>
-        <w:t xml:space="preserve"> </w:t>
-      </w:r>
-      <w:r>
-        <w:rPr>
-          <w:lang w:val="ru-RU"/>
-        </w:rPr>
-        <w:t>таблицы</w:t>
-      </w:r>
-      <w:r>
-        <w:rPr>
-          <w:lang w:val="ru-RU"/>
-        </w:rPr>
-        <w:t xml:space="preserve"> —</w:t>
+        <w:t xml:space="preserve"> таблицы —</w:t>
       </w:r>
       <w:r>
         <w:rPr>
@@ -2050,7 +2129,7 @@
       <w:spacing w:before="240" w:after="120"/>
     </w:pPr>
     <w:rPr>
-      <w:rFonts w:ascii="Liberation Sans" w:hAnsi="Liberation Sans" w:eastAsia="Noto Sans CJK SC" w:cs="Noto Sans Devanagari"/>
+      <w:rFonts w:ascii="Liberation Sans" w:hAnsi="Liberation Sans" w:eastAsia="Microsoft YaHei" w:cs="Lucida Sans"/>
       <w:sz w:val="28"/>
       <w:szCs w:val="28"/>
     </w:rPr>
@@ -2095,7 +2174,7 @@
       <w:suppressLineNumbers/>
     </w:pPr>
     <w:rPr>
-      <w:rFonts w:cs="Noto Sans Devanagari"/>
+      <w:rFonts w:cs="Lucida Sans"/>
     </w:rPr>
   </w:style>
   <w:style w:type="paragraph" w:styleId="user">
@@ -2108,7 +2187,7 @@
       <w:spacing w:before="240" w:after="120"/>
     </w:pPr>
     <w:rPr>
-      <w:rFonts w:ascii="Liberation Sans" w:hAnsi="Liberation Sans" w:eastAsia="Microsoft YaHei" w:cs="Lucida Sans"/>
+      <w:rFonts w:ascii="Liberation Sans" w:hAnsi="Liberation Sans" w:eastAsia="Noto Sans CJK SC" w:cs="Noto Sans Devanagari"/>
       <w:sz w:val="28"/>
       <w:szCs w:val="28"/>
     </w:rPr>
@@ -2121,7 +2200,7 @@
       <w:suppressLineNumbers/>
     </w:pPr>
     <w:rPr>
-      <w:rFonts w:cs="Lucida Sans"/>
+      <w:rFonts w:cs="Noto Sans Devanagari"/>
     </w:rPr>
   </w:style>
 </w:styles>

</xml_diff>

<commit_message>
add lint for tables and figures placed before first reference
</commit_message>
<xml_diff>
--- a/WordStyleCheck/rules.docx
+++ b/WordStyleCheck/rules.docx
@@ -979,65 +979,100 @@
         <w:rPr>
           <w:lang w:val="en-US"/>
         </w:rPr>
-        <w:t xml:space="preserve">@BEGIN </w:t>
-      </w:r>
-      <w:r>
-        <w:rPr>
-          <w:lang w:val="en-US"/>
-        </w:rPr>
-        <w:t>Table</w:t>
-      </w:r>
-      <w:r>
-        <w:rPr>
-          <w:lang w:val="en-US"/>
-        </w:rPr>
-        <w:t>NotReferenced</w:t>
-      </w:r>
-    </w:p>
-    <w:p>
-      <w:pPr>
-        <w:pStyle w:val="Normal"/>
-        <w:bidi w:val="0"/>
-        <w:jc w:val="left"/>
-        <w:rPr>
-          <w:lang w:val="ru-RU"/>
-        </w:rPr>
-      </w:pPr>
-      <w:r>
-        <w:rPr>
-          <w:lang w:val="ru-RU"/>
-        </w:rPr>
-        <w:t>Таблица</w:t>
-      </w:r>
-      <w:r>
-        <w:rPr>
-          <w:lang w:val="ru-RU"/>
-        </w:rPr>
-        <w:t xml:space="preserve"> не был</w:t>
-      </w:r>
-      <w:r>
-        <w:rPr>
-          <w:lang w:val="ru-RU"/>
-        </w:rPr>
-        <w:t>а</w:t>
-      </w:r>
-      <w:r>
-        <w:rPr>
-          <w:lang w:val="ru-RU"/>
-        </w:rPr>
-        <w:t xml:space="preserve"> упомянут</w:t>
-      </w:r>
-      <w:r>
-        <w:rPr>
-          <w:lang w:val="ru-RU"/>
-        </w:rPr>
-        <w:t>а</w:t>
-      </w:r>
-      <w:r>
-        <w:rPr>
-          <w:lang w:val="ru-RU"/>
-        </w:rPr>
-        <w:t xml:space="preserve"> в тексте.</w:t>
+        <w:t>@BEGIN FigureBeforeFirstReference</w:t>
+      </w:r>
+    </w:p>
+    <w:p>
+      <w:pPr>
+        <w:pStyle w:val="Normal"/>
+        <w:bidi w:val="0"/>
+        <w:jc w:val="left"/>
+        <w:rPr>
+          <w:lang w:val="ru-RU"/>
+        </w:rPr>
+      </w:pPr>
+      <w:r>
+        <w:rPr>
+          <w:lang w:val="ru-RU"/>
+        </w:rPr>
+        <w:t xml:space="preserve">Рисунок должен быть расположен </w:t>
+      </w:r>
+      <w:r>
+        <w:rPr>
+          <w:b/>
+          <w:bCs/>
+          <w:lang w:val="ru-RU"/>
+        </w:rPr>
+        <w:t>после</w:t>
+      </w:r>
+      <w:r>
+        <w:rPr>
+          <w:lang w:val="ru-RU"/>
+        </w:rPr>
+        <w:t xml:space="preserve"> своего первого упоминания.</w:t>
+      </w:r>
+    </w:p>
+    <w:p>
+      <w:pPr>
+        <w:pStyle w:val="Normal"/>
+        <w:bidi w:val="0"/>
+        <w:jc w:val="left"/>
+        <w:rPr>
+          <w:lang w:val="en-US"/>
+        </w:rPr>
+      </w:pPr>
+      <w:r>
+        <w:rPr>
+          <w:lang w:val="en-US"/>
+        </w:rPr>
+        <w:t>@END</w:t>
+      </w:r>
+    </w:p>
+    <w:p>
+      <w:pPr>
+        <w:pStyle w:val="Normal"/>
+        <w:bidi w:val="0"/>
+        <w:jc w:val="left"/>
+        <w:rPr>
+          <w:lang w:val="en-US"/>
+        </w:rPr>
+      </w:pPr>
+      <w:r>
+        <w:rPr>
+          <w:lang w:val="en-US"/>
+        </w:rPr>
+      </w:r>
+    </w:p>
+    <w:p>
+      <w:pPr>
+        <w:pStyle w:val="Normal"/>
+        <w:bidi w:val="0"/>
+        <w:jc w:val="left"/>
+        <w:rPr>
+          <w:lang w:val="en-US"/>
+        </w:rPr>
+      </w:pPr>
+      <w:r>
+        <w:rPr>
+          <w:lang w:val="en-US"/>
+        </w:rPr>
+        <w:t>@BEGIN TableNotReferenced</w:t>
+      </w:r>
+    </w:p>
+    <w:p>
+      <w:pPr>
+        <w:pStyle w:val="Normal"/>
+        <w:bidi w:val="0"/>
+        <w:jc w:val="left"/>
+        <w:rPr>
+          <w:lang w:val="ru-RU"/>
+        </w:rPr>
+      </w:pPr>
+      <w:r>
+        <w:rPr>
+          <w:lang w:val="ru-RU"/>
+        </w:rPr>
+        <w:t>Таблица не была упомянута в тексте.</w:t>
       </w:r>
     </w:p>
     <w:p>
@@ -1051,6 +1086,83 @@
       </w:pPr>
       <w:r>
         <w:rPr/>
+        <w:t>@END</w:t>
+      </w:r>
+    </w:p>
+    <w:p>
+      <w:pPr>
+        <w:pStyle w:val="Normal"/>
+        <w:bidi w:val="0"/>
+        <w:jc w:val="left"/>
+        <w:rPr>
+          <w:lang w:val="en-US"/>
+        </w:rPr>
+      </w:pPr>
+      <w:r>
+        <w:rPr>
+          <w:lang w:val="en-US"/>
+        </w:rPr>
+      </w:r>
+    </w:p>
+    <w:p>
+      <w:pPr>
+        <w:pStyle w:val="Normal"/>
+        <w:bidi w:val="0"/>
+        <w:jc w:val="left"/>
+        <w:rPr>
+          <w:lang w:val="en-US"/>
+        </w:rPr>
+      </w:pPr>
+      <w:r>
+        <w:rPr>
+          <w:lang w:val="en-US"/>
+        </w:rPr>
+        <w:t>@BEGIN TableBeforeFirstReference</w:t>
+      </w:r>
+    </w:p>
+    <w:p>
+      <w:pPr>
+        <w:pStyle w:val="Normal"/>
+        <w:bidi w:val="0"/>
+        <w:jc w:val="left"/>
+        <w:rPr>
+          <w:lang w:val="ru-RU"/>
+        </w:rPr>
+      </w:pPr>
+      <w:r>
+        <w:rPr>
+          <w:lang w:val="ru-RU"/>
+        </w:rPr>
+        <w:t xml:space="preserve">Таблица должна быть расположена </w:t>
+      </w:r>
+      <w:r>
+        <w:rPr>
+          <w:b/>
+          <w:bCs/>
+          <w:lang w:val="ru-RU"/>
+        </w:rPr>
+        <w:t>после</w:t>
+      </w:r>
+      <w:r>
+        <w:rPr>
+          <w:lang w:val="ru-RU"/>
+        </w:rPr>
+        <w:t xml:space="preserve"> своего первого упоминания.</w:t>
+      </w:r>
+    </w:p>
+    <w:p>
+      <w:pPr>
+        <w:pStyle w:val="Normal"/>
+        <w:bidi w:val="0"/>
+        <w:jc w:val="left"/>
+        <w:rPr>
+          <w:lang w:val="en-US"/>
+        </w:rPr>
+      </w:pPr>
+      <w:r>
+        <w:rPr>
+          <w:lang w:val="en-US"/>
+        </w:rPr>
         <w:t>@END</w:t>
       </w:r>
     </w:p>
@@ -2129,7 +2241,7 @@
       <w:spacing w:before="240" w:after="120"/>
     </w:pPr>
     <w:rPr>
-      <w:rFonts w:ascii="Liberation Sans" w:hAnsi="Liberation Sans" w:eastAsia="Microsoft YaHei" w:cs="Lucida Sans"/>
+      <w:rFonts w:ascii="Liberation Sans" w:hAnsi="Liberation Sans" w:eastAsia="Noto Sans CJK SC" w:cs="Noto Sans Devanagari"/>
       <w:sz w:val="28"/>
       <w:szCs w:val="28"/>
     </w:rPr>
@@ -2174,7 +2286,7 @@
       <w:suppressLineNumbers/>
     </w:pPr>
     <w:rPr>
-      <w:rFonts w:cs="Lucida Sans"/>
+      <w:rFonts w:cs="Noto Sans Devanagari"/>
     </w:rPr>
   </w:style>
   <w:style w:type="paragraph" w:styleId="user">
@@ -2187,7 +2299,7 @@
       <w:spacing w:before="240" w:after="120"/>
     </w:pPr>
     <w:rPr>
-      <w:rFonts w:ascii="Liberation Sans" w:hAnsi="Liberation Sans" w:eastAsia="Noto Sans CJK SC" w:cs="Noto Sans Devanagari"/>
+      <w:rFonts w:ascii="Liberation Sans" w:hAnsi="Liberation Sans" w:eastAsia="Microsoft YaHei" w:cs="Lucida Sans"/>
       <w:sz w:val="28"/>
       <w:szCs w:val="28"/>
     </w:rPr>
@@ -2200,7 +2312,7 @@
       <w:suppressLineNumbers/>
     </w:pPr>
     <w:rPr>
-      <w:rFonts w:cs="Noto Sans Devanagari"/>
+      <w:rFonts w:cs="Lucida Sans"/>
     </w:rPr>
   </w:style>
 </w:styles>

</xml_diff>

<commit_message>
add outline level lint
</commit_message>
<xml_diff>
--- a/WordStyleCheck/rules.docx
+++ b/WordStyleCheck/rules.docx
@@ -2163,6 +2163,195 @@
           <w:lang w:val="ru-RU"/>
         </w:rPr>
         <w:t>— «$Expected».</w:t>
+      </w:r>
+    </w:p>
+    <w:p>
+      <w:pPr>
+        <w:pStyle w:val="Normal"/>
+        <w:bidi w:val="0"/>
+        <w:jc w:val="left"/>
+        <w:rPr>
+          <w:lang w:val="en-US"/>
+        </w:rPr>
+      </w:pPr>
+      <w:r>
+        <w:rPr>
+          <w:lang w:val="en-US"/>
+        </w:rPr>
+        <w:t>@END</w:t>
+      </w:r>
+    </w:p>
+    <w:p>
+      <w:pPr>
+        <w:pStyle w:val="Normal"/>
+        <w:bidi w:val="0"/>
+        <w:jc w:val="left"/>
+        <w:rPr>
+          <w:lang w:val="en-US"/>
+        </w:rPr>
+      </w:pPr>
+      <w:r>
+        <w:rPr>
+          <w:lang w:val="en-US"/>
+        </w:rPr>
+      </w:r>
+    </w:p>
+    <w:p>
+      <w:pPr>
+        <w:pStyle w:val="Normal"/>
+        <w:bidi w:val="0"/>
+        <w:jc w:val="left"/>
+        <w:rPr>
+          <w:lang w:val="en-US"/>
+        </w:rPr>
+      </w:pPr>
+      <w:r>
+        <w:rPr>
+          <w:lang w:val="en-US"/>
+        </w:rPr>
+        <w:t>@BEGIN BodyTextInToC</w:t>
+      </w:r>
+    </w:p>
+    <w:p>
+      <w:pPr>
+        <w:pStyle w:val="Normal"/>
+        <w:bidi w:val="0"/>
+        <w:jc w:val="left"/>
+        <w:rPr>
+          <w:lang w:val="ru-RU"/>
+        </w:rPr>
+      </w:pPr>
+      <w:r>
+        <w:rPr>
+          <w:lang w:val="ru-RU"/>
+        </w:rPr>
+        <w:t>Абзац текста работы не должен быть в содержании.</w:t>
+      </w:r>
+    </w:p>
+    <w:p>
+      <w:pPr>
+        <w:pStyle w:val="Normal"/>
+        <w:bidi w:val="0"/>
+        <w:jc w:val="left"/>
+        <w:rPr>
+          <w:lang w:val="en-US"/>
+        </w:rPr>
+      </w:pPr>
+      <w:r>
+        <w:rPr>
+          <w:lang w:val="en-US"/>
+        </w:rPr>
+        <w:t>@END</w:t>
+      </w:r>
+    </w:p>
+    <w:p>
+      <w:pPr>
+        <w:pStyle w:val="Normal"/>
+        <w:bidi w:val="0"/>
+        <w:jc w:val="left"/>
+        <w:rPr>
+          <w:lang w:val="en-US"/>
+        </w:rPr>
+      </w:pPr>
+      <w:r>
+        <w:rPr>
+          <w:lang w:val="en-US"/>
+        </w:rPr>
+      </w:r>
+    </w:p>
+    <w:p>
+      <w:pPr>
+        <w:pStyle w:val="Normal"/>
+        <w:bidi w:val="0"/>
+        <w:jc w:val="left"/>
+        <w:rPr>
+          <w:lang w:val="en-US"/>
+        </w:rPr>
+      </w:pPr>
+      <w:r>
+        <w:rPr>
+          <w:lang w:val="en-US"/>
+        </w:rPr>
+        <w:t>@BEGIN IncorrectHeaderOutlineLevel</w:t>
+      </w:r>
+    </w:p>
+    <w:p>
+      <w:pPr>
+        <w:pStyle w:val="Normal"/>
+        <w:bidi w:val="0"/>
+        <w:jc w:val="left"/>
+        <w:rPr>
+          <w:lang w:val="ru-RU"/>
+        </w:rPr>
+      </w:pPr>
+      <w:r>
+        <w:rPr>
+          <w:lang w:val="ru-RU"/>
+        </w:rPr>
+        <w:t>Уровень заголовка в содержании должен совпадать с его уровнем.</w:t>
+      </w:r>
+    </w:p>
+    <w:p>
+      <w:pPr>
+        <w:pStyle w:val="Normal"/>
+        <w:bidi w:val="0"/>
+        <w:jc w:val="left"/>
+        <w:rPr>
+          <w:lang w:val="en-US"/>
+        </w:rPr>
+      </w:pPr>
+      <w:r>
+        <w:rPr>
+          <w:lang w:val="en-US"/>
+        </w:rPr>
+        <w:t>@END</w:t>
+      </w:r>
+    </w:p>
+    <w:p>
+      <w:pPr>
+        <w:pStyle w:val="Normal"/>
+        <w:bidi w:val="0"/>
+        <w:jc w:val="left"/>
+        <w:rPr>
+          <w:lang w:val="en-US"/>
+        </w:rPr>
+      </w:pPr>
+      <w:r>
+        <w:rPr>
+          <w:lang w:val="en-US"/>
+        </w:rPr>
+      </w:r>
+    </w:p>
+    <w:p>
+      <w:pPr>
+        <w:pStyle w:val="Normal"/>
+        <w:bidi w:val="0"/>
+        <w:jc w:val="left"/>
+        <w:rPr>
+          <w:lang w:val="en-US"/>
+        </w:rPr>
+      </w:pPr>
+      <w:r>
+        <w:rPr>
+          <w:lang w:val="en-US"/>
+        </w:rPr>
+        <w:t>@BEGIN SubPointsInToC</w:t>
+      </w:r>
+    </w:p>
+    <w:p>
+      <w:pPr>
+        <w:pStyle w:val="Normal"/>
+        <w:bidi w:val="0"/>
+        <w:jc w:val="left"/>
+        <w:rPr>
+          <w:lang w:val="ru-RU"/>
+        </w:rPr>
+      </w:pPr>
+      <w:r>
+        <w:rPr>
+          <w:lang w:val="ru-RU"/>
+        </w:rPr>
+        <w:t>Заголовки подпунктов не должны присутствовать в содержании</w:t>
       </w:r>
     </w:p>
     <w:p>
@@ -2241,7 +2430,7 @@
       <w:spacing w:before="240" w:after="120"/>
     </w:pPr>
     <w:rPr>
-      <w:rFonts w:ascii="Liberation Sans" w:hAnsi="Liberation Sans" w:eastAsia="Noto Sans CJK SC" w:cs="Noto Sans Devanagari"/>
+      <w:rFonts w:ascii="Liberation Sans" w:hAnsi="Liberation Sans" w:eastAsia="Microsoft YaHei" w:cs="Lucida Sans"/>
       <w:sz w:val="28"/>
       <w:szCs w:val="28"/>
     </w:rPr>
@@ -2286,7 +2475,7 @@
       <w:suppressLineNumbers/>
     </w:pPr>
     <w:rPr>
-      <w:rFonts w:cs="Noto Sans Devanagari"/>
+      <w:rFonts w:cs="Lucida Sans"/>
     </w:rPr>
   </w:style>
   <w:style w:type="paragraph" w:styleId="user">
@@ -2299,7 +2488,7 @@
       <w:spacing w:before="240" w:after="120"/>
     </w:pPr>
     <w:rPr>
-      <w:rFonts w:ascii="Liberation Sans" w:hAnsi="Liberation Sans" w:eastAsia="Microsoft YaHei" w:cs="Lucida Sans"/>
+      <w:rFonts w:ascii="Liberation Sans" w:hAnsi="Liberation Sans" w:eastAsia="Noto Sans CJK SC" w:cs="Noto Sans Devanagari"/>
       <w:sz w:val="28"/>
       <w:szCs w:val="28"/>
     </w:rPr>
@@ -2312,7 +2501,7 @@
       <w:suppressLineNumbers/>
     </w:pPr>
     <w:rPr>
-      <w:rFonts w:cs="Lucida Sans"/>
+      <w:rFonts w:cs="Noto Sans Devanagari"/>
     </w:rPr>
   </w:style>
 </w:styles>

</xml_diff>

<commit_message>
add lint for justification of table captions
</commit_message>
<xml_diff>
--- a/WordStyleCheck/rules.docx
+++ b/WordStyleCheck/rules.docx
@@ -1488,6 +1488,75 @@
       </w:pPr>
       <w:r>
         <w:rPr/>
+        <w:t>@END</w:t>
+      </w:r>
+    </w:p>
+    <w:p>
+      <w:pPr>
+        <w:pStyle w:val="Normal"/>
+        <w:bidi w:val="0"/>
+        <w:jc w:val="left"/>
+        <w:rPr>
+          <w:lang w:val="en-US"/>
+        </w:rPr>
+      </w:pPr>
+      <w:r>
+        <w:rPr>
+          <w:lang w:val="en-US"/>
+        </w:rPr>
+      </w:r>
+    </w:p>
+    <w:p>
+      <w:pPr>
+        <w:pStyle w:val="Normal"/>
+        <w:bidi w:val="0"/>
+        <w:jc w:val="left"/>
+        <w:rPr>
+          <w:lang w:val="en-US"/>
+        </w:rPr>
+      </w:pPr>
+      <w:r>
+        <w:rPr>
+          <w:lang w:val="en-US"/>
+        </w:rPr>
+        <w:t>@BEGIN TableCaptionNotLeftAligned</w:t>
+      </w:r>
+    </w:p>
+    <w:p>
+      <w:pPr>
+        <w:pStyle w:val="Normal"/>
+        <w:bidi w:val="0"/>
+        <w:jc w:val="left"/>
+        <w:rPr>
+          <w:lang w:val="en-US"/>
+        </w:rPr>
+      </w:pPr>
+      <w:r>
+        <w:rPr>
+          <w:lang w:val="en-US"/>
+        </w:rPr>
+        <w:t xml:space="preserve">Подписи к таблицам должны быть </w:t>
+      </w:r>
+      <w:r>
+        <w:rPr>
+          <w:lang w:val="en-US"/>
+        </w:rPr>
+        <w:t>помещаны над таблицей слева.</w:t>
+      </w:r>
+    </w:p>
+    <w:p>
+      <w:pPr>
+        <w:pStyle w:val="Normal"/>
+        <w:bidi w:val="0"/>
+        <w:jc w:val="left"/>
+        <w:rPr>
+          <w:lang w:val="en-US"/>
+        </w:rPr>
+      </w:pPr>
+      <w:r>
+        <w:rPr>
+          <w:lang w:val="en-US"/>
+        </w:rPr>
         <w:t>@END</w:t>
       </w:r>
     </w:p>
@@ -2420,8 +2489,8 @@
       <w:lang w:val="ru-RU" w:eastAsia="zh-CN" w:bidi="hi-IN"/>
     </w:rPr>
   </w:style>
-  <w:style w:type="paragraph" w:styleId="Style14">
-    <w:name w:val="Заголовок"/>
+  <w:style w:type="paragraph" w:styleId="Heading">
+    <w:name w:val="Heading"/>
     <w:basedOn w:val="Normal"/>
     <w:next w:val="BodyText"/>
     <w:qFormat/>
@@ -2430,7 +2499,7 @@
       <w:spacing w:before="240" w:after="120"/>
     </w:pPr>
     <w:rPr>
-      <w:rFonts w:ascii="Liberation Sans" w:hAnsi="Liberation Sans" w:eastAsia="Microsoft YaHei" w:cs="Lucida Sans"/>
+      <w:rFonts w:ascii="Liberation Sans" w:hAnsi="Liberation Sans" w:eastAsia="Noto Sans CJK SC" w:cs="Noto Sans Devanagari"/>
       <w:sz w:val="28"/>
       <w:szCs w:val="28"/>
     </w:rPr>
@@ -2467,19 +2536,19 @@
       <w:szCs w:val="24"/>
     </w:rPr>
   </w:style>
-  <w:style w:type="paragraph" w:styleId="Style15">
-    <w:name w:val="Указатель"/>
+  <w:style w:type="paragraph" w:styleId="Index">
+    <w:name w:val="Index"/>
     <w:basedOn w:val="Normal"/>
     <w:qFormat/>
     <w:pPr>
       <w:suppressLineNumbers/>
     </w:pPr>
     <w:rPr>
-      <w:rFonts w:cs="Lucida Sans"/>
+      <w:rFonts w:cs="Noto Sans Devanagari"/>
     </w:rPr>
   </w:style>
-  <w:style w:type="paragraph" w:styleId="user">
-    <w:name w:val="Заголовок (user)"/>
+  <w:style w:type="paragraph" w:styleId="Style14">
+    <w:name w:val="Заголовок"/>
     <w:basedOn w:val="Normal"/>
     <w:next w:val="BodyText"/>
     <w:qFormat/>
@@ -2493,8 +2562,8 @@
       <w:szCs w:val="28"/>
     </w:rPr>
   </w:style>
-  <w:style w:type="paragraph" w:styleId="user1">
-    <w:name w:val="Указатель (user)"/>
+  <w:style w:type="paragraph" w:styleId="Style15">
+    <w:name w:val="Указатель"/>
     <w:basedOn w:val="Normal"/>
     <w:qFormat/>
     <w:pPr>
@@ -2515,37 +2584,37 @@
         <a:srgbClr val="000000"/>
       </a:dk1>
       <a:lt1>
-        <a:srgbClr val="ffffff"/>
+        <a:srgbClr val="FFFFFF"/>
       </a:lt1>
       <a:dk2>
         <a:srgbClr val="000000"/>
       </a:dk2>
       <a:lt2>
-        <a:srgbClr val="ffffff"/>
+        <a:srgbClr val="FFFFFF"/>
       </a:lt2>
       <a:accent1>
-        <a:srgbClr val="18a303"/>
+        <a:srgbClr val="18A303"/>
       </a:accent1>
       <a:accent2>
-        <a:srgbClr val="0369a3"/>
+        <a:srgbClr val="0369A3"/>
       </a:accent2>
       <a:accent3>
-        <a:srgbClr val="a33e03"/>
+        <a:srgbClr val="A33E03"/>
       </a:accent3>
       <a:accent4>
-        <a:srgbClr val="8e03a3"/>
+        <a:srgbClr val="8E03A3"/>
       </a:accent4>
       <a:accent5>
-        <a:srgbClr val="c99c00"/>
+        <a:srgbClr val="C99C00"/>
       </a:accent5>
       <a:accent6>
-        <a:srgbClr val="c9211e"/>
+        <a:srgbClr val="C9211E"/>
       </a:accent6>
       <a:hlink>
-        <a:srgbClr val="0000ee"/>
+        <a:srgbClr val="0000EE"/>
       </a:hlink>
       <a:folHlink>
-        <a:srgbClr val="551a8b"/>
+        <a:srgbClr val="551A8B"/>
       </a:folHlink>
     </a:clrScheme>
     <a:fontScheme name="Office">

</xml_diff>

<commit_message>
make parameter interpolation syntax have brackets
</commit_message>
<xml_diff>
--- a/WordStyleCheck/rules.docx
+++ b/WordStyleCheck/rules.docx
@@ -31,7 +31,103 @@
         <w:rPr>
           <w:lang w:val="en-US"/>
         </w:rPr>
-        <w:t>Размер страницы должнен быть A4. ($ExpectedWidthCmсм × $ExpectedHeightCmсм ≠ $ActualWidthCmсм × $ActualHeightCmсм)</w:t>
+        <w:t>Размер страницы должнен быть A4. ($</w:t>
+      </w:r>
+      <w:r>
+        <w:rPr>
+          <w:lang w:val="en-US"/>
+        </w:rPr>
+        <w:t>{</w:t>
+      </w:r>
+      <w:r>
+        <w:rPr>
+          <w:lang w:val="en-US"/>
+        </w:rPr>
+        <w:t>ExpectedWidthCm</w:t>
+      </w:r>
+      <w:r>
+        <w:rPr>
+          <w:lang w:val="en-US"/>
+        </w:rPr>
+        <w:t>}</w:t>
+      </w:r>
+      <w:r>
+        <w:rPr>
+          <w:lang w:val="en-US"/>
+        </w:rPr>
+        <w:t>см × $</w:t>
+      </w:r>
+      <w:r>
+        <w:rPr>
+          <w:lang w:val="en-US"/>
+        </w:rPr>
+        <w:t>{</w:t>
+      </w:r>
+      <w:r>
+        <w:rPr>
+          <w:lang w:val="en-US"/>
+        </w:rPr>
+        <w:t>ExpectedHeightCm</w:t>
+      </w:r>
+      <w:r>
+        <w:rPr>
+          <w:lang w:val="en-US"/>
+        </w:rPr>
+        <w:t>}</w:t>
+      </w:r>
+      <w:r>
+        <w:rPr>
+          <w:lang w:val="en-US"/>
+        </w:rPr>
+        <w:t>см ≠ $</w:t>
+      </w:r>
+      <w:r>
+        <w:rPr>
+          <w:lang w:val="en-US"/>
+        </w:rPr>
+        <w:t>{</w:t>
+      </w:r>
+      <w:r>
+        <w:rPr>
+          <w:lang w:val="en-US"/>
+        </w:rPr>
+        <w:t>ActualWidthCm</w:t>
+      </w:r>
+      <w:r>
+        <w:rPr>
+          <w:lang w:val="en-US"/>
+        </w:rPr>
+        <w:t>}</w:t>
+      </w:r>
+      <w:r>
+        <w:rPr>
+          <w:lang w:val="en-US"/>
+        </w:rPr>
+        <w:t>см × $</w:t>
+      </w:r>
+      <w:r>
+        <w:rPr>
+          <w:lang w:val="en-US"/>
+        </w:rPr>
+        <w:t>{</w:t>
+      </w:r>
+      <w:r>
+        <w:rPr>
+          <w:lang w:val="en-US"/>
+        </w:rPr>
+        <w:t>ActualHeightCm</w:t>
+      </w:r>
+      <w:r>
+        <w:rPr>
+          <w:lang w:val="en-US"/>
+        </w:rPr>
+        <w:t>}</w:t>
+      </w:r>
+      <w:r>
+        <w:rPr>
+          <w:lang w:val="en-US"/>
+        </w:rPr>
+        <w:t>см)</w:t>
       </w:r>
     </w:p>
     <w:p>
@@ -124,7 +220,31 @@
         <w:rPr>
           <w:lang w:val="en-US"/>
         </w:rPr>
-        <w:t xml:space="preserve"> $ExpectedLeftCmсм, правое </w:t>
+        <w:t xml:space="preserve"> $</w:t>
+      </w:r>
+      <w:r>
+        <w:rPr>
+          <w:lang w:val="en-US"/>
+        </w:rPr>
+        <w:t>{</w:t>
+      </w:r>
+      <w:r>
+        <w:rPr>
+          <w:lang w:val="en-US"/>
+        </w:rPr>
+        <w:t>ExpectedLeftCm</w:t>
+      </w:r>
+      <w:r>
+        <w:rPr>
+          <w:lang w:val="en-US"/>
+        </w:rPr>
+        <w:t>}</w:t>
+      </w:r>
+      <w:r>
+        <w:rPr>
+          <w:lang w:val="en-US"/>
+        </w:rPr>
+        <w:t xml:space="preserve">см, правое </w:t>
       </w:r>
       <w:r>
         <w:rPr>
@@ -136,7 +256,31 @@
         <w:rPr>
           <w:lang w:val="en-US"/>
         </w:rPr>
-        <w:t xml:space="preserve"> $ExpectedRightCmсм, верхнее </w:t>
+        <w:t xml:space="preserve"> $</w:t>
+      </w:r>
+      <w:r>
+        <w:rPr>
+          <w:lang w:val="en-US"/>
+        </w:rPr>
+        <w:t>{</w:t>
+      </w:r>
+      <w:r>
+        <w:rPr>
+          <w:lang w:val="en-US"/>
+        </w:rPr>
+        <w:t>ExpectedRightCm</w:t>
+      </w:r>
+      <w:r>
+        <w:rPr>
+          <w:lang w:val="en-US"/>
+        </w:rPr>
+        <w:t>}</w:t>
+      </w:r>
+      <w:r>
+        <w:rPr>
+          <w:lang w:val="en-US"/>
+        </w:rPr>
+        <w:t xml:space="preserve">см, верхнее </w:t>
       </w:r>
       <w:r>
         <w:rPr>
@@ -148,7 +292,31 @@
         <w:rPr>
           <w:lang w:val="en-US"/>
         </w:rPr>
-        <w:t xml:space="preserve"> $ExpectedTopCmсм, нижнее </w:t>
+        <w:t xml:space="preserve"> $</w:t>
+      </w:r>
+      <w:r>
+        <w:rPr>
+          <w:lang w:val="en-US"/>
+        </w:rPr>
+        <w:t>{</w:t>
+      </w:r>
+      <w:r>
+        <w:rPr>
+          <w:lang w:val="en-US"/>
+        </w:rPr>
+        <w:t>ExpectedTopCm</w:t>
+      </w:r>
+      <w:r>
+        <w:rPr>
+          <w:lang w:val="en-US"/>
+        </w:rPr>
+        <w:t>}</w:t>
+      </w:r>
+      <w:r>
+        <w:rPr>
+          <w:lang w:val="en-US"/>
+        </w:rPr>
+        <w:t xml:space="preserve">см, нижнее </w:t>
       </w:r>
       <w:r>
         <w:rPr>
@@ -160,7 +328,31 @@
         <w:rPr>
           <w:lang w:val="en-US"/>
         </w:rPr>
-        <w:t xml:space="preserve"> $ExpectedBottomCmсм.</w:t>
+        <w:t xml:space="preserve"> $</w:t>
+      </w:r>
+      <w:r>
+        <w:rPr>
+          <w:lang w:val="en-US"/>
+        </w:rPr>
+        <w:t>{</w:t>
+      </w:r>
+      <w:r>
+        <w:rPr>
+          <w:lang w:val="en-US"/>
+        </w:rPr>
+        <w:t>ExpectedBottomCm</w:t>
+      </w:r>
+      <w:r>
+        <w:rPr>
+          <w:lang w:val="en-US"/>
+        </w:rPr>
+        <w:t>}</w:t>
+      </w:r>
+      <w:r>
+        <w:rPr>
+          <w:lang w:val="en-US"/>
+        </w:rPr>
+        <w:t>см.</w:t>
       </w:r>
     </w:p>
     <w:p>
@@ -286,7 +478,31 @@
         <w:rPr>
           <w:lang w:val="en-US"/>
         </w:rPr>
-        <w:t>В тексте работы должен быть абзацный отступ $ExpectedCmсм.</w:t>
+        <w:t>В тексте работы должен быть абзацный отступ $</w:t>
+      </w:r>
+      <w:r>
+        <w:rPr>
+          <w:lang w:val="en-US"/>
+        </w:rPr>
+        <w:t>{</w:t>
+      </w:r>
+      <w:r>
+        <w:rPr>
+          <w:lang w:val="en-US"/>
+        </w:rPr>
+        <w:t>ExpectedCm</w:t>
+      </w:r>
+      <w:r>
+        <w:rPr>
+          <w:lang w:val="en-US"/>
+        </w:rPr>
+        <w:t>}</w:t>
+      </w:r>
+      <w:r>
+        <w:rPr>
+          <w:lang w:val="en-US"/>
+        </w:rPr>
+        <w:t>см.</w:t>
       </w:r>
     </w:p>
     <w:p>
@@ -410,7 +626,31 @@
         <w:rPr>
           <w:lang w:val="en-US"/>
         </w:rPr>
-        <w:t>Этот заголовок должен иметь абзацный отступ $ExpectedCmсм.</w:t>
+        <w:t>Этот заголовок должен иметь абзацный отступ $</w:t>
+      </w:r>
+      <w:r>
+        <w:rPr>
+          <w:lang w:val="en-US"/>
+        </w:rPr>
+        <w:t>{</w:t>
+      </w:r>
+      <w:r>
+        <w:rPr>
+          <w:lang w:val="en-US"/>
+        </w:rPr>
+        <w:t>ExpectedCm</w:t>
+      </w:r>
+      <w:r>
+        <w:rPr>
+          <w:lang w:val="en-US"/>
+        </w:rPr>
+        <w:t>}</w:t>
+      </w:r>
+      <w:r>
+        <w:rPr>
+          <w:lang w:val="en-US"/>
+        </w:rPr>
+        <w:t>см.</w:t>
       </w:r>
     </w:p>
     <w:p>
@@ -471,7 +711,31 @@
         <w:rPr>
           <w:lang w:val="en-US"/>
         </w:rPr>
-        <w:t>Этот заголовок должен иметь отступ слева $ExpectedCmсм.</w:t>
+        <w:t>Этот заголовок должен иметь отступ слева $</w:t>
+      </w:r>
+      <w:r>
+        <w:rPr>
+          <w:lang w:val="en-US"/>
+        </w:rPr>
+        <w:t>{</w:t>
+      </w:r>
+      <w:r>
+        <w:rPr>
+          <w:lang w:val="en-US"/>
+        </w:rPr>
+        <w:t>ExpectedCm</w:t>
+      </w:r>
+      <w:r>
+        <w:rPr>
+          <w:lang w:val="en-US"/>
+        </w:rPr>
+        <w:t>}</w:t>
+      </w:r>
+      <w:r>
+        <w:rPr>
+          <w:lang w:val="en-US"/>
+        </w:rPr>
+        <w:t>см.</w:t>
       </w:r>
     </w:p>
     <w:p>
@@ -662,7 +926,25 @@
         <w:rPr>
           <w:lang w:val="en-US"/>
         </w:rPr>
-        <w:t>$Expected</w:t>
+        <w:t>$</w:t>
+      </w:r>
+      <w:r>
+        <w:rPr>
+          <w:lang w:val="en-US"/>
+        </w:rPr>
+        <w:t>{</w:t>
+      </w:r>
+      <w:r>
+        <w:rPr>
+          <w:lang w:val="en-US"/>
+        </w:rPr>
+        <w:t>Expected</w:t>
+      </w:r>
+      <w:r>
+        <w:rPr>
+          <w:lang w:val="en-US"/>
+        </w:rPr>
+        <w:t>}</w:t>
       </w:r>
       <w:r>
         <w:rPr>
@@ -863,7 +1145,25 @@
         <w:rPr>
           <w:lang w:val="en-US"/>
         </w:rPr>
-        <w:t>$Expected</w:t>
+        <w:t>$</w:t>
+      </w:r>
+      <w:r>
+        <w:rPr>
+          <w:lang w:val="en-US"/>
+        </w:rPr>
+        <w:t>{</w:t>
+      </w:r>
+      <w:r>
+        <w:rPr>
+          <w:lang w:val="en-US"/>
+        </w:rPr>
+        <w:t>Expected</w:t>
+      </w:r>
+      <w:r>
+        <w:rPr>
+          <w:lang w:val="en-US"/>
+        </w:rPr>
+        <w:t>}</w:t>
       </w:r>
       <w:r>
         <w:rPr>
@@ -1216,7 +1516,31 @@
         <w:rPr>
           <w:lang w:val="en-US"/>
         </w:rPr>
-        <w:t xml:space="preserve">$Expected, </w:t>
+        <w:t>$</w:t>
+      </w:r>
+      <w:r>
+        <w:rPr>
+          <w:lang w:val="en-US"/>
+        </w:rPr>
+        <w:t>{</w:t>
+      </w:r>
+      <w:r>
+        <w:rPr>
+          <w:lang w:val="en-US"/>
+        </w:rPr>
+        <w:t>Expected</w:t>
+      </w:r>
+      <w:r>
+        <w:rPr>
+          <w:lang w:val="en-US"/>
+        </w:rPr>
+        <w:t>}</w:t>
+      </w:r>
+      <w:r>
+        <w:rPr>
+          <w:lang w:val="en-US"/>
+        </w:rPr>
+        <w:t xml:space="preserve">, </w:t>
       </w:r>
       <w:r>
         <w:rPr>
@@ -1228,7 +1552,31 @@
         <w:rPr>
           <w:lang w:val="en-US"/>
         </w:rPr>
-        <w:t>$Actual.</w:t>
+        <w:t>$</w:t>
+      </w:r>
+      <w:r>
+        <w:rPr>
+          <w:lang w:val="en-US"/>
+        </w:rPr>
+        <w:t>{</w:t>
+      </w:r>
+      <w:r>
+        <w:rPr>
+          <w:lang w:val="en-US"/>
+        </w:rPr>
+        <w:t>Actual</w:t>
+      </w:r>
+      <w:r>
+        <w:rPr>
+          <w:lang w:val="en-US"/>
+        </w:rPr>
+        <w:t>}</w:t>
+      </w:r>
+      <w:r>
+        <w:rPr>
+          <w:lang w:val="en-US"/>
+        </w:rPr>
+        <w:t>.</w:t>
       </w:r>
     </w:p>
     <w:p>
@@ -1535,19 +1883,7 @@
         <w:rPr>
           <w:lang w:val="en-US"/>
         </w:rPr>
-        <w:t>Подписи к таблицам должны быть помещ</w:t>
-      </w:r>
-      <w:r>
-        <w:rPr>
-          <w:lang w:val="en-US"/>
-        </w:rPr>
-        <w:t>е</w:t>
-      </w:r>
-      <w:r>
-        <w:rPr>
-          <w:lang w:val="en-US"/>
-        </w:rPr>
-        <w:t>ны над таблицей слева.</w:t>
+        <w:t>Подписи к таблицам должны быть помещены над таблицей слева.</w:t>
       </w:r>
     </w:p>
     <w:p>
@@ -1748,7 +2084,31 @@
         <w:rPr>
           <w:lang w:val="en-US"/>
         </w:rPr>
-        <w:t xml:space="preserve"> $Expected.</w:t>
+        <w:t xml:space="preserve"> $</w:t>
+      </w:r>
+      <w:r>
+        <w:rPr>
+          <w:lang w:val="en-US"/>
+        </w:rPr>
+        <w:t>{</w:t>
+      </w:r>
+      <w:r>
+        <w:rPr>
+          <w:lang w:val="en-US"/>
+        </w:rPr>
+        <w:t>Expected</w:t>
+      </w:r>
+      <w:r>
+        <w:rPr>
+          <w:lang w:val="en-US"/>
+        </w:rPr>
+        <w:t>}</w:t>
+      </w:r>
+      <w:r>
+        <w:rPr>
+          <w:lang w:val="en-US"/>
+        </w:rPr>
+        <w:t>.</w:t>
       </w:r>
     </w:p>
     <w:p>
@@ -1829,7 +2189,31 @@
         <w:rPr>
           <w:lang w:val="en-US"/>
         </w:rPr>
-        <w:t xml:space="preserve"> $Expected.</w:t>
+        <w:t xml:space="preserve"> $</w:t>
+      </w:r>
+      <w:r>
+        <w:rPr>
+          <w:lang w:val="en-US"/>
+        </w:rPr>
+        <w:t>{</w:t>
+      </w:r>
+      <w:r>
+        <w:rPr>
+          <w:lang w:val="en-US"/>
+        </w:rPr>
+        <w:t>Expected</w:t>
+      </w:r>
+      <w:r>
+        <w:rPr>
+          <w:lang w:val="en-US"/>
+        </w:rPr>
+        <w:t>}</w:t>
+      </w:r>
+      <w:r>
+        <w:rPr>
+          <w:lang w:val="en-US"/>
+        </w:rPr>
+        <w:t>.</w:t>
       </w:r>
     </w:p>
     <w:p>
@@ -1896,7 +2280,31 @@
         <w:rPr>
           <w:lang w:val="en-US"/>
         </w:rPr>
-        <w:t xml:space="preserve">$Expected, </w:t>
+        <w:t>$</w:t>
+      </w:r>
+      <w:r>
+        <w:rPr>
+          <w:lang w:val="en-US"/>
+        </w:rPr>
+        <w:t>{</w:t>
+      </w:r>
+      <w:r>
+        <w:rPr>
+          <w:lang w:val="en-US"/>
+        </w:rPr>
+        <w:t>Expected</w:t>
+      </w:r>
+      <w:r>
+        <w:rPr>
+          <w:lang w:val="en-US"/>
+        </w:rPr>
+        <w:t>}</w:t>
+      </w:r>
+      <w:r>
+        <w:rPr>
+          <w:lang w:val="en-US"/>
+        </w:rPr>
+        <w:t xml:space="preserve">, </w:t>
       </w:r>
       <w:r>
         <w:rPr>
@@ -1908,7 +2316,31 @@
         <w:rPr>
           <w:lang w:val="en-US"/>
         </w:rPr>
-        <w:t>$Actual.</w:t>
+        <w:t>$</w:t>
+      </w:r>
+      <w:r>
+        <w:rPr>
+          <w:lang w:val="en-US"/>
+        </w:rPr>
+        <w:t>{</w:t>
+      </w:r>
+      <w:r>
+        <w:rPr>
+          <w:lang w:val="en-US"/>
+        </w:rPr>
+        <w:t>Actual</w:t>
+      </w:r>
+      <w:r>
+        <w:rPr>
+          <w:lang w:val="en-US"/>
+        </w:rPr>
+        <w:t>}</w:t>
+      </w:r>
+      <w:r>
+        <w:rPr>
+          <w:lang w:val="en-US"/>
+        </w:rPr>
+        <w:t>.</w:t>
       </w:r>
     </w:p>
     <w:p>
@@ -2030,7 +2462,31 @@
         <w:rPr>
           <w:lang w:val="en-US"/>
         </w:rPr>
-        <w:t>Между этими абзацами должен быть интервал $ExpectedPtпт.</w:t>
+        <w:t>Между этими абзацами должен быть интервал $</w:t>
+      </w:r>
+      <w:r>
+        <w:rPr>
+          <w:lang w:val="en-US"/>
+        </w:rPr>
+        <w:t>{</w:t>
+      </w:r>
+      <w:r>
+        <w:rPr>
+          <w:lang w:val="en-US"/>
+        </w:rPr>
+        <w:t>ExpectedPt</w:t>
+      </w:r>
+      <w:r>
+        <w:rPr>
+          <w:lang w:val="en-US"/>
+        </w:rPr>
+        <w:t>}</w:t>
+      </w:r>
+      <w:r>
+        <w:rPr>
+          <w:lang w:val="en-US"/>
+        </w:rPr>
+        <w:t>пт.</w:t>
       </w:r>
     </w:p>
     <w:p>
@@ -2168,7 +2624,31 @@
         <w:rPr>
           <w:lang w:val="en-US"/>
         </w:rPr>
-        <w:t>Размер шрифта должен быть не менее $ExpectedPtпт.</w:t>
+        <w:t>Размер шрифта должен быть не менее $</w:t>
+      </w:r>
+      <w:r>
+        <w:rPr>
+          <w:lang w:val="en-US"/>
+        </w:rPr>
+        <w:t>{</w:t>
+      </w:r>
+      <w:r>
+        <w:rPr>
+          <w:lang w:val="en-US"/>
+        </w:rPr>
+        <w:t>ExpectedPt</w:t>
+      </w:r>
+      <w:r>
+        <w:rPr>
+          <w:lang w:val="en-US"/>
+        </w:rPr>
+        <w:t>}</w:t>
+      </w:r>
+      <w:r>
+        <w:rPr>
+          <w:lang w:val="en-US"/>
+        </w:rPr>
+        <w:t>пт.</w:t>
       </w:r>
     </w:p>
     <w:p>
@@ -2237,7 +2717,31 @@
         <w:rPr>
           <w:lang w:val="ru-RU"/>
         </w:rPr>
-        <w:t>— «$Expected».</w:t>
+        <w:t>— «$</w:t>
+      </w:r>
+      <w:r>
+        <w:rPr>
+          <w:lang w:val="ru-RU"/>
+        </w:rPr>
+        <w:t>{</w:t>
+      </w:r>
+      <w:r>
+        <w:rPr>
+          <w:lang w:val="ru-RU"/>
+        </w:rPr>
+        <w:t>Expected</w:t>
+      </w:r>
+      <w:r>
+        <w:rPr>
+          <w:lang w:val="ru-RU"/>
+        </w:rPr>
+        <w:t>}</w:t>
+      </w:r>
+      <w:r>
+        <w:rPr>
+          <w:lang w:val="ru-RU"/>
+        </w:rPr>
+        <w:t>».</w:t>
       </w:r>
     </w:p>
     <w:p>

</xml_diff>

<commit_message>
add translations for toc references lint
</commit_message>
<xml_diff>
--- a/WordStyleCheck/rules.docx
+++ b/WordStyleCheck/rules.docx
@@ -31,103 +31,7 @@
         <w:rPr>
           <w:lang w:val="en-US"/>
         </w:rPr>
-        <w:t>Размер страницы должнен быть A4. ($</w:t>
-      </w:r>
-      <w:r>
-        <w:rPr>
-          <w:lang w:val="en-US"/>
-        </w:rPr>
-        <w:t>{</w:t>
-      </w:r>
-      <w:r>
-        <w:rPr>
-          <w:lang w:val="en-US"/>
-        </w:rPr>
-        <w:t>ExpectedWidthCm</w:t>
-      </w:r>
-      <w:r>
-        <w:rPr>
-          <w:lang w:val="en-US"/>
-        </w:rPr>
-        <w:t>}</w:t>
-      </w:r>
-      <w:r>
-        <w:rPr>
-          <w:lang w:val="en-US"/>
-        </w:rPr>
-        <w:t>см × $</w:t>
-      </w:r>
-      <w:r>
-        <w:rPr>
-          <w:lang w:val="en-US"/>
-        </w:rPr>
-        <w:t>{</w:t>
-      </w:r>
-      <w:r>
-        <w:rPr>
-          <w:lang w:val="en-US"/>
-        </w:rPr>
-        <w:t>ExpectedHeightCm</w:t>
-      </w:r>
-      <w:r>
-        <w:rPr>
-          <w:lang w:val="en-US"/>
-        </w:rPr>
-        <w:t>}</w:t>
-      </w:r>
-      <w:r>
-        <w:rPr>
-          <w:lang w:val="en-US"/>
-        </w:rPr>
-        <w:t>см ≠ $</w:t>
-      </w:r>
-      <w:r>
-        <w:rPr>
-          <w:lang w:val="en-US"/>
-        </w:rPr>
-        <w:t>{</w:t>
-      </w:r>
-      <w:r>
-        <w:rPr>
-          <w:lang w:val="en-US"/>
-        </w:rPr>
-        <w:t>ActualWidthCm</w:t>
-      </w:r>
-      <w:r>
-        <w:rPr>
-          <w:lang w:val="en-US"/>
-        </w:rPr>
-        <w:t>}</w:t>
-      </w:r>
-      <w:r>
-        <w:rPr>
-          <w:lang w:val="en-US"/>
-        </w:rPr>
-        <w:t>см × $</w:t>
-      </w:r>
-      <w:r>
-        <w:rPr>
-          <w:lang w:val="en-US"/>
-        </w:rPr>
-        <w:t>{</w:t>
-      </w:r>
-      <w:r>
-        <w:rPr>
-          <w:lang w:val="en-US"/>
-        </w:rPr>
-        <w:t>ActualHeightCm</w:t>
-      </w:r>
-      <w:r>
-        <w:rPr>
-          <w:lang w:val="en-US"/>
-        </w:rPr>
-        <w:t>}</w:t>
-      </w:r>
-      <w:r>
-        <w:rPr>
-          <w:lang w:val="en-US"/>
-        </w:rPr>
-        <w:t>см)</w:t>
+        <w:t>Размер страницы должнен быть A4. (${ExpectedWidthCm}см × ${ExpectedHeightCm}см ≠ ${ActualWidthCm}см × ${ActualHeightCm}см)</w:t>
       </w:r>
     </w:p>
     <w:p>
@@ -220,31 +124,7 @@
         <w:rPr>
           <w:lang w:val="en-US"/>
         </w:rPr>
-        <w:t xml:space="preserve"> $</w:t>
-      </w:r>
-      <w:r>
-        <w:rPr>
-          <w:lang w:val="en-US"/>
-        </w:rPr>
-        <w:t>{</w:t>
-      </w:r>
-      <w:r>
-        <w:rPr>
-          <w:lang w:val="en-US"/>
-        </w:rPr>
-        <w:t>ExpectedLeftCm</w:t>
-      </w:r>
-      <w:r>
-        <w:rPr>
-          <w:lang w:val="en-US"/>
-        </w:rPr>
-        <w:t>}</w:t>
-      </w:r>
-      <w:r>
-        <w:rPr>
-          <w:lang w:val="en-US"/>
-        </w:rPr>
-        <w:t xml:space="preserve">см, правое </w:t>
+        <w:t xml:space="preserve"> ${ExpectedLeftCm}см, правое </w:t>
       </w:r>
       <w:r>
         <w:rPr>
@@ -256,31 +136,7 @@
         <w:rPr>
           <w:lang w:val="en-US"/>
         </w:rPr>
-        <w:t xml:space="preserve"> $</w:t>
-      </w:r>
-      <w:r>
-        <w:rPr>
-          <w:lang w:val="en-US"/>
-        </w:rPr>
-        <w:t>{</w:t>
-      </w:r>
-      <w:r>
-        <w:rPr>
-          <w:lang w:val="en-US"/>
-        </w:rPr>
-        <w:t>ExpectedRightCm</w:t>
-      </w:r>
-      <w:r>
-        <w:rPr>
-          <w:lang w:val="en-US"/>
-        </w:rPr>
-        <w:t>}</w:t>
-      </w:r>
-      <w:r>
-        <w:rPr>
-          <w:lang w:val="en-US"/>
-        </w:rPr>
-        <w:t xml:space="preserve">см, верхнее </w:t>
+        <w:t xml:space="preserve"> ${ExpectedRightCm}см, верхнее </w:t>
       </w:r>
       <w:r>
         <w:rPr>
@@ -292,31 +148,7 @@
         <w:rPr>
           <w:lang w:val="en-US"/>
         </w:rPr>
-        <w:t xml:space="preserve"> $</w:t>
-      </w:r>
-      <w:r>
-        <w:rPr>
-          <w:lang w:val="en-US"/>
-        </w:rPr>
-        <w:t>{</w:t>
-      </w:r>
-      <w:r>
-        <w:rPr>
-          <w:lang w:val="en-US"/>
-        </w:rPr>
-        <w:t>ExpectedTopCm</w:t>
-      </w:r>
-      <w:r>
-        <w:rPr>
-          <w:lang w:val="en-US"/>
-        </w:rPr>
-        <w:t>}</w:t>
-      </w:r>
-      <w:r>
-        <w:rPr>
-          <w:lang w:val="en-US"/>
-        </w:rPr>
-        <w:t xml:space="preserve">см, нижнее </w:t>
+        <w:t xml:space="preserve"> ${ExpectedTopCm}см, нижнее </w:t>
       </w:r>
       <w:r>
         <w:rPr>
@@ -328,31 +160,7 @@
         <w:rPr>
           <w:lang w:val="en-US"/>
         </w:rPr>
-        <w:t xml:space="preserve"> $</w:t>
-      </w:r>
-      <w:r>
-        <w:rPr>
-          <w:lang w:val="en-US"/>
-        </w:rPr>
-        <w:t>{</w:t>
-      </w:r>
-      <w:r>
-        <w:rPr>
-          <w:lang w:val="en-US"/>
-        </w:rPr>
-        <w:t>ExpectedBottomCm</w:t>
-      </w:r>
-      <w:r>
-        <w:rPr>
-          <w:lang w:val="en-US"/>
-        </w:rPr>
-        <w:t>}</w:t>
-      </w:r>
-      <w:r>
-        <w:rPr>
-          <w:lang w:val="en-US"/>
-        </w:rPr>
-        <w:t>см.</w:t>
+        <w:t xml:space="preserve"> ${ExpectedBottomCm}см.</w:t>
       </w:r>
     </w:p>
     <w:p>
@@ -478,31 +286,7 @@
         <w:rPr>
           <w:lang w:val="en-US"/>
         </w:rPr>
-        <w:t>В тексте работы должен быть абзацный отступ $</w:t>
-      </w:r>
-      <w:r>
-        <w:rPr>
-          <w:lang w:val="en-US"/>
-        </w:rPr>
-        <w:t>{</w:t>
-      </w:r>
-      <w:r>
-        <w:rPr>
-          <w:lang w:val="en-US"/>
-        </w:rPr>
-        <w:t>ExpectedCm</w:t>
-      </w:r>
-      <w:r>
-        <w:rPr>
-          <w:lang w:val="en-US"/>
-        </w:rPr>
-        <w:t>}</w:t>
-      </w:r>
-      <w:r>
-        <w:rPr>
-          <w:lang w:val="en-US"/>
-        </w:rPr>
-        <w:t>см.</w:t>
+        <w:t>В тексте работы должен быть абзацный отступ ${ExpectedCm}см.</w:t>
       </w:r>
     </w:p>
     <w:p>
@@ -626,31 +410,7 @@
         <w:rPr>
           <w:lang w:val="en-US"/>
         </w:rPr>
-        <w:t>Этот заголовок должен иметь абзацный отступ $</w:t>
-      </w:r>
-      <w:r>
-        <w:rPr>
-          <w:lang w:val="en-US"/>
-        </w:rPr>
-        <w:t>{</w:t>
-      </w:r>
-      <w:r>
-        <w:rPr>
-          <w:lang w:val="en-US"/>
-        </w:rPr>
-        <w:t>ExpectedCm</w:t>
-      </w:r>
-      <w:r>
-        <w:rPr>
-          <w:lang w:val="en-US"/>
-        </w:rPr>
-        <w:t>}</w:t>
-      </w:r>
-      <w:r>
-        <w:rPr>
-          <w:lang w:val="en-US"/>
-        </w:rPr>
-        <w:t>см.</w:t>
+        <w:t>Этот заголовок должен иметь абзацный отступ ${ExpectedCm}см.</w:t>
       </w:r>
     </w:p>
     <w:p>
@@ -711,31 +471,7 @@
         <w:rPr>
           <w:lang w:val="en-US"/>
         </w:rPr>
-        <w:t>Этот заголовок должен иметь отступ слева $</w:t>
-      </w:r>
-      <w:r>
-        <w:rPr>
-          <w:lang w:val="en-US"/>
-        </w:rPr>
-        <w:t>{</w:t>
-      </w:r>
-      <w:r>
-        <w:rPr>
-          <w:lang w:val="en-US"/>
-        </w:rPr>
-        <w:t>ExpectedCm</w:t>
-      </w:r>
-      <w:r>
-        <w:rPr>
-          <w:lang w:val="en-US"/>
-        </w:rPr>
-        <w:t>}</w:t>
-      </w:r>
-      <w:r>
-        <w:rPr>
-          <w:lang w:val="en-US"/>
-        </w:rPr>
-        <w:t>см.</w:t>
+        <w:t>Этот заголовок должен иметь отступ слева ${ExpectedCm}см.</w:t>
       </w:r>
     </w:p>
     <w:p>
@@ -926,25 +662,7 @@
         <w:rPr>
           <w:lang w:val="en-US"/>
         </w:rPr>
-        <w:t>$</w:t>
-      </w:r>
-      <w:r>
-        <w:rPr>
-          <w:lang w:val="en-US"/>
-        </w:rPr>
-        <w:t>{</w:t>
-      </w:r>
-      <w:r>
-        <w:rPr>
-          <w:lang w:val="en-US"/>
-        </w:rPr>
-        <w:t>Expected</w:t>
-      </w:r>
-      <w:r>
-        <w:rPr>
-          <w:lang w:val="en-US"/>
-        </w:rPr>
-        <w:t>}</w:t>
+        <w:t>${Expected}</w:t>
       </w:r>
       <w:r>
         <w:rPr>
@@ -1145,25 +863,7 @@
         <w:rPr>
           <w:lang w:val="en-US"/>
         </w:rPr>
-        <w:t>$</w:t>
-      </w:r>
-      <w:r>
-        <w:rPr>
-          <w:lang w:val="en-US"/>
-        </w:rPr>
-        <w:t>{</w:t>
-      </w:r>
-      <w:r>
-        <w:rPr>
-          <w:lang w:val="en-US"/>
-        </w:rPr>
-        <w:t>Expected</w:t>
-      </w:r>
-      <w:r>
-        <w:rPr>
-          <w:lang w:val="en-US"/>
-        </w:rPr>
-        <w:t>}</w:t>
+        <w:t>${Expected}</w:t>
       </w:r>
       <w:r>
         <w:rPr>
@@ -1516,31 +1216,7 @@
         <w:rPr>
           <w:lang w:val="en-US"/>
         </w:rPr>
-        <w:t>$</w:t>
-      </w:r>
-      <w:r>
-        <w:rPr>
-          <w:lang w:val="en-US"/>
-        </w:rPr>
-        <w:t>{</w:t>
-      </w:r>
-      <w:r>
-        <w:rPr>
-          <w:lang w:val="en-US"/>
-        </w:rPr>
-        <w:t>Expected</w:t>
-      </w:r>
-      <w:r>
-        <w:rPr>
-          <w:lang w:val="en-US"/>
-        </w:rPr>
-        <w:t>}</w:t>
-      </w:r>
-      <w:r>
-        <w:rPr>
-          <w:lang w:val="en-US"/>
-        </w:rPr>
-        <w:t xml:space="preserve">, </w:t>
+        <w:t xml:space="preserve">${Expected}, </w:t>
       </w:r>
       <w:r>
         <w:rPr>
@@ -1552,31 +1228,7 @@
         <w:rPr>
           <w:lang w:val="en-US"/>
         </w:rPr>
-        <w:t>$</w:t>
-      </w:r>
-      <w:r>
-        <w:rPr>
-          <w:lang w:val="en-US"/>
-        </w:rPr>
-        <w:t>{</w:t>
-      </w:r>
-      <w:r>
-        <w:rPr>
-          <w:lang w:val="en-US"/>
-        </w:rPr>
-        <w:t>Actual</w:t>
-      </w:r>
-      <w:r>
-        <w:rPr>
-          <w:lang w:val="en-US"/>
-        </w:rPr>
-        <w:t>}</w:t>
-      </w:r>
-      <w:r>
-        <w:rPr>
-          <w:lang w:val="en-US"/>
-        </w:rPr>
-        <w:t>.</w:t>
+        <w:t>${Actual}.</w:t>
       </w:r>
     </w:p>
     <w:p>
@@ -2084,31 +1736,7 @@
         <w:rPr>
           <w:lang w:val="en-US"/>
         </w:rPr>
-        <w:t xml:space="preserve"> $</w:t>
-      </w:r>
-      <w:r>
-        <w:rPr>
-          <w:lang w:val="en-US"/>
-        </w:rPr>
-        <w:t>{</w:t>
-      </w:r>
-      <w:r>
-        <w:rPr>
-          <w:lang w:val="en-US"/>
-        </w:rPr>
-        <w:t>Expected</w:t>
-      </w:r>
-      <w:r>
-        <w:rPr>
-          <w:lang w:val="en-US"/>
-        </w:rPr>
-        <w:t>}</w:t>
-      </w:r>
-      <w:r>
-        <w:rPr>
-          <w:lang w:val="en-US"/>
-        </w:rPr>
-        <w:t>.</w:t>
+        <w:t xml:space="preserve"> ${Expected}.</w:t>
       </w:r>
     </w:p>
     <w:p>
@@ -2189,31 +1817,7 @@
         <w:rPr>
           <w:lang w:val="en-US"/>
         </w:rPr>
-        <w:t xml:space="preserve"> $</w:t>
-      </w:r>
-      <w:r>
-        <w:rPr>
-          <w:lang w:val="en-US"/>
-        </w:rPr>
-        <w:t>{</w:t>
-      </w:r>
-      <w:r>
-        <w:rPr>
-          <w:lang w:val="en-US"/>
-        </w:rPr>
-        <w:t>Expected</w:t>
-      </w:r>
-      <w:r>
-        <w:rPr>
-          <w:lang w:val="en-US"/>
-        </w:rPr>
-        <w:t>}</w:t>
-      </w:r>
-      <w:r>
-        <w:rPr>
-          <w:lang w:val="en-US"/>
-        </w:rPr>
-        <w:t>.</w:t>
+        <w:t xml:space="preserve"> ${Expected}.</w:t>
       </w:r>
     </w:p>
     <w:p>
@@ -2280,31 +1884,7 @@
         <w:rPr>
           <w:lang w:val="en-US"/>
         </w:rPr>
-        <w:t>$</w:t>
-      </w:r>
-      <w:r>
-        <w:rPr>
-          <w:lang w:val="en-US"/>
-        </w:rPr>
-        <w:t>{</w:t>
-      </w:r>
-      <w:r>
-        <w:rPr>
-          <w:lang w:val="en-US"/>
-        </w:rPr>
-        <w:t>Expected</w:t>
-      </w:r>
-      <w:r>
-        <w:rPr>
-          <w:lang w:val="en-US"/>
-        </w:rPr>
-        <w:t>}</w:t>
-      </w:r>
-      <w:r>
-        <w:rPr>
-          <w:lang w:val="en-US"/>
-        </w:rPr>
-        <w:t xml:space="preserve">, </w:t>
+        <w:t xml:space="preserve">${Expected}, </w:t>
       </w:r>
       <w:r>
         <w:rPr>
@@ -2316,31 +1896,7 @@
         <w:rPr>
           <w:lang w:val="en-US"/>
         </w:rPr>
-        <w:t>$</w:t>
-      </w:r>
-      <w:r>
-        <w:rPr>
-          <w:lang w:val="en-US"/>
-        </w:rPr>
-        <w:t>{</w:t>
-      </w:r>
-      <w:r>
-        <w:rPr>
-          <w:lang w:val="en-US"/>
-        </w:rPr>
-        <w:t>Actual</w:t>
-      </w:r>
-      <w:r>
-        <w:rPr>
-          <w:lang w:val="en-US"/>
-        </w:rPr>
-        <w:t>}</w:t>
-      </w:r>
-      <w:r>
-        <w:rPr>
-          <w:lang w:val="en-US"/>
-        </w:rPr>
-        <w:t>.</w:t>
+        <w:t>${Actual}.</w:t>
       </w:r>
     </w:p>
     <w:p>
@@ -2462,31 +2018,7 @@
         <w:rPr>
           <w:lang w:val="en-US"/>
         </w:rPr>
-        <w:t>Между этими абзацами должен быть интервал $</w:t>
-      </w:r>
-      <w:r>
-        <w:rPr>
-          <w:lang w:val="en-US"/>
-        </w:rPr>
-        <w:t>{</w:t>
-      </w:r>
-      <w:r>
-        <w:rPr>
-          <w:lang w:val="en-US"/>
-        </w:rPr>
-        <w:t>ExpectedPt</w:t>
-      </w:r>
-      <w:r>
-        <w:rPr>
-          <w:lang w:val="en-US"/>
-        </w:rPr>
-        <w:t>}</w:t>
-      </w:r>
-      <w:r>
-        <w:rPr>
-          <w:lang w:val="en-US"/>
-        </w:rPr>
-        <w:t>пт.</w:t>
+        <w:t>Между этими абзацами должен быть интервал ${ExpectedPt}пт.</w:t>
       </w:r>
     </w:p>
     <w:p>
@@ -2624,31 +2156,7 @@
         <w:rPr>
           <w:lang w:val="en-US"/>
         </w:rPr>
-        <w:t>Размер шрифта должен быть не менее $</w:t>
-      </w:r>
-      <w:r>
-        <w:rPr>
-          <w:lang w:val="en-US"/>
-        </w:rPr>
-        <w:t>{</w:t>
-      </w:r>
-      <w:r>
-        <w:rPr>
-          <w:lang w:val="en-US"/>
-        </w:rPr>
-        <w:t>ExpectedPt</w:t>
-      </w:r>
-      <w:r>
-        <w:rPr>
-          <w:lang w:val="en-US"/>
-        </w:rPr>
-        <w:t>}</w:t>
-      </w:r>
-      <w:r>
-        <w:rPr>
-          <w:lang w:val="en-US"/>
-        </w:rPr>
-        <w:t>пт.</w:t>
+        <w:t>Размер шрифта должен быть не менее ${ExpectedPt}пт.</w:t>
       </w:r>
     </w:p>
     <w:p>
@@ -2717,220 +2225,196 @@
         <w:rPr>
           <w:lang w:val="ru-RU"/>
         </w:rPr>
-        <w:t>— «$</w:t>
-      </w:r>
-      <w:r>
-        <w:rPr>
-          <w:lang w:val="ru-RU"/>
-        </w:rPr>
-        <w:t>{</w:t>
-      </w:r>
-      <w:r>
-        <w:rPr>
-          <w:lang w:val="ru-RU"/>
-        </w:rPr>
-        <w:t>Expected</w:t>
-      </w:r>
-      <w:r>
-        <w:rPr>
-          <w:lang w:val="ru-RU"/>
-        </w:rPr>
-        <w:t>}</w:t>
-      </w:r>
-      <w:r>
-        <w:rPr>
-          <w:lang w:val="ru-RU"/>
-        </w:rPr>
-        <w:t>».</w:t>
-      </w:r>
-    </w:p>
-    <w:p>
-      <w:pPr>
-        <w:pStyle w:val="Normal"/>
-        <w:bidi w:val="0"/>
-        <w:jc w:val="left"/>
-        <w:rPr>
-          <w:lang w:val="en-US"/>
-        </w:rPr>
-      </w:pPr>
-      <w:r>
-        <w:rPr>
-          <w:lang w:val="en-US"/>
-        </w:rPr>
-        <w:t>@END</w:t>
-      </w:r>
-    </w:p>
-    <w:p>
-      <w:pPr>
-        <w:pStyle w:val="Normal"/>
-        <w:bidi w:val="0"/>
-        <w:jc w:val="left"/>
-        <w:rPr>
-          <w:lang w:val="en-US"/>
-        </w:rPr>
-      </w:pPr>
-      <w:r>
-        <w:rPr>
-          <w:lang w:val="en-US"/>
-        </w:rPr>
-      </w:r>
-    </w:p>
-    <w:p>
-      <w:pPr>
-        <w:pStyle w:val="Normal"/>
-        <w:bidi w:val="0"/>
-        <w:jc w:val="left"/>
-        <w:rPr>
-          <w:lang w:val="en-US"/>
-        </w:rPr>
-      </w:pPr>
-      <w:r>
-        <w:rPr>
-          <w:lang w:val="en-US"/>
-        </w:rPr>
-        <w:t>@BEGIN BodyTextInToC</w:t>
-      </w:r>
-    </w:p>
-    <w:p>
-      <w:pPr>
-        <w:pStyle w:val="Normal"/>
-        <w:bidi w:val="0"/>
-        <w:jc w:val="left"/>
-        <w:rPr>
-          <w:lang w:val="ru-RU"/>
-        </w:rPr>
-      </w:pPr>
-      <w:r>
-        <w:rPr>
-          <w:lang w:val="ru-RU"/>
-        </w:rPr>
-        <w:t>Абзац текста работы не должен быть в содержании.</w:t>
-      </w:r>
-    </w:p>
-    <w:p>
-      <w:pPr>
-        <w:pStyle w:val="Normal"/>
-        <w:bidi w:val="0"/>
-        <w:jc w:val="left"/>
-        <w:rPr>
-          <w:lang w:val="en-US"/>
-        </w:rPr>
-      </w:pPr>
-      <w:r>
-        <w:rPr>
-          <w:lang w:val="en-US"/>
-        </w:rPr>
-        <w:t>@END</w:t>
-      </w:r>
-    </w:p>
-    <w:p>
-      <w:pPr>
-        <w:pStyle w:val="Normal"/>
-        <w:bidi w:val="0"/>
-        <w:jc w:val="left"/>
-        <w:rPr>
-          <w:lang w:val="en-US"/>
-        </w:rPr>
-      </w:pPr>
-      <w:r>
-        <w:rPr>
-          <w:lang w:val="en-US"/>
-        </w:rPr>
-      </w:r>
-    </w:p>
-    <w:p>
-      <w:pPr>
-        <w:pStyle w:val="Normal"/>
-        <w:bidi w:val="0"/>
-        <w:jc w:val="left"/>
-        <w:rPr>
-          <w:lang w:val="en-US"/>
-        </w:rPr>
-      </w:pPr>
-      <w:r>
-        <w:rPr>
-          <w:lang w:val="en-US"/>
-        </w:rPr>
-        <w:t>@BEGIN IncorrectHeaderOutlineLevel</w:t>
-      </w:r>
-    </w:p>
-    <w:p>
-      <w:pPr>
-        <w:pStyle w:val="Normal"/>
-        <w:bidi w:val="0"/>
-        <w:jc w:val="left"/>
-        <w:rPr>
-          <w:lang w:val="ru-RU"/>
-        </w:rPr>
-      </w:pPr>
-      <w:r>
-        <w:rPr>
-          <w:lang w:val="ru-RU"/>
-        </w:rPr>
-        <w:t>Уровень заголовка в содержании должен совпадать с его уровнем.</w:t>
-      </w:r>
-    </w:p>
-    <w:p>
-      <w:pPr>
-        <w:pStyle w:val="Normal"/>
-        <w:bidi w:val="0"/>
-        <w:jc w:val="left"/>
-        <w:rPr>
-          <w:lang w:val="en-US"/>
-        </w:rPr>
-      </w:pPr>
-      <w:r>
-        <w:rPr>
-          <w:lang w:val="en-US"/>
-        </w:rPr>
-        <w:t>@END</w:t>
-      </w:r>
-    </w:p>
-    <w:p>
-      <w:pPr>
-        <w:pStyle w:val="Normal"/>
-        <w:bidi w:val="0"/>
-        <w:jc w:val="left"/>
-        <w:rPr>
-          <w:lang w:val="en-US"/>
-        </w:rPr>
-      </w:pPr>
-      <w:r>
-        <w:rPr>
-          <w:lang w:val="en-US"/>
-        </w:rPr>
-      </w:r>
-    </w:p>
-    <w:p>
-      <w:pPr>
-        <w:pStyle w:val="Normal"/>
-        <w:bidi w:val="0"/>
-        <w:jc w:val="left"/>
-        <w:rPr>
-          <w:lang w:val="en-US"/>
-        </w:rPr>
-      </w:pPr>
-      <w:r>
-        <w:rPr>
-          <w:lang w:val="en-US"/>
-        </w:rPr>
-        <w:t>@BEGIN SubPointsInToC</w:t>
-      </w:r>
-    </w:p>
-    <w:p>
-      <w:pPr>
-        <w:pStyle w:val="Normal"/>
-        <w:bidi w:val="0"/>
-        <w:jc w:val="left"/>
-        <w:rPr>
-          <w:lang w:val="ru-RU"/>
-        </w:rPr>
-      </w:pPr>
-      <w:r>
-        <w:rPr>
-          <w:lang w:val="ru-RU"/>
-        </w:rPr>
-        <w:t>Заголовки подпунктов не должны присутствовать в содержании</w:t>
+        <w:t>— «${Expected}».</w:t>
+      </w:r>
+    </w:p>
+    <w:p>
+      <w:pPr>
+        <w:pStyle w:val="Normal"/>
+        <w:bidi w:val="0"/>
+        <w:jc w:val="left"/>
+        <w:rPr>
+          <w:lang w:val="en-US"/>
+        </w:rPr>
+      </w:pPr>
+      <w:r>
+        <w:rPr>
+          <w:lang w:val="en-US"/>
+        </w:rPr>
+        <w:t>@END</w:t>
+      </w:r>
+    </w:p>
+    <w:p>
+      <w:pPr>
+        <w:pStyle w:val="Normal"/>
+        <w:bidi w:val="0"/>
+        <w:jc w:val="left"/>
+        <w:rPr>
+          <w:lang w:val="en-US"/>
+        </w:rPr>
+      </w:pPr>
+      <w:r>
+        <w:rPr>
+          <w:lang w:val="en-US"/>
+        </w:rPr>
+      </w:r>
+    </w:p>
+    <w:p>
+      <w:pPr>
+        <w:pStyle w:val="Normal"/>
+        <w:bidi w:val="0"/>
+        <w:jc w:val="left"/>
+        <w:rPr>
+          <w:lang w:val="en-US"/>
+        </w:rPr>
+      </w:pPr>
+      <w:r>
+        <w:rPr>
+          <w:lang w:val="en-US"/>
+        </w:rPr>
+        <w:t>@BEGIN NoToc</w:t>
+      </w:r>
+    </w:p>
+    <w:p>
+      <w:pPr>
+        <w:pStyle w:val="Normal"/>
+        <w:bidi w:val="0"/>
+        <w:jc w:val="left"/>
+        <w:rPr>
+          <w:lang w:val="en-US"/>
+        </w:rPr>
+      </w:pPr>
+      <w:r>
+        <w:rPr>
+          <w:lang w:val="en-US"/>
+        </w:rPr>
+        <w:t>Не найдено содержание.</w:t>
+      </w:r>
+    </w:p>
+    <w:p>
+      <w:pPr>
+        <w:pStyle w:val="Normal"/>
+        <w:bidi w:val="0"/>
+        <w:jc w:val="left"/>
+        <w:rPr>
+          <w:lang w:val="en-US"/>
+        </w:rPr>
+      </w:pPr>
+      <w:r>
+        <w:rPr>
+          <w:lang w:val="en-US"/>
+        </w:rPr>
+        <w:t>@END</w:t>
+      </w:r>
+    </w:p>
+    <w:p>
+      <w:pPr>
+        <w:pStyle w:val="Normal"/>
+        <w:bidi w:val="0"/>
+        <w:jc w:val="left"/>
+        <w:rPr>
+          <w:lang w:val="en-US"/>
+        </w:rPr>
+      </w:pPr>
+      <w:r>
+        <w:rPr>
+          <w:lang w:val="en-US"/>
+        </w:rPr>
+      </w:r>
+    </w:p>
+    <w:p>
+      <w:pPr>
+        <w:pStyle w:val="Normal"/>
+        <w:bidi w:val="0"/>
+        <w:jc w:val="left"/>
+        <w:rPr>
+          <w:lang w:val="en-US"/>
+        </w:rPr>
+      </w:pPr>
+      <w:r>
+        <w:rPr>
+          <w:lang w:val="en-US"/>
+        </w:rPr>
+        <w:t>@BEGIN ShouldNotBeInToc</w:t>
+      </w:r>
+    </w:p>
+    <w:p>
+      <w:pPr>
+        <w:pStyle w:val="Normal"/>
+        <w:bidi w:val="0"/>
+        <w:jc w:val="left"/>
+        <w:rPr>
+          <w:lang w:val="en-US"/>
+        </w:rPr>
+      </w:pPr>
+      <w:r>
+        <w:rPr>
+          <w:lang w:val="en-US"/>
+        </w:rPr>
+        <w:t>Абзац не должен быть в содержании.</w:t>
+      </w:r>
+    </w:p>
+    <w:p>
+      <w:pPr>
+        <w:pStyle w:val="Normal"/>
+        <w:bidi w:val="0"/>
+        <w:jc w:val="left"/>
+        <w:rPr>
+          <w:lang w:val="en-US"/>
+        </w:rPr>
+      </w:pPr>
+      <w:r>
+        <w:rPr>
+          <w:lang w:val="en-US"/>
+        </w:rPr>
+        <w:t>@END</w:t>
+      </w:r>
+    </w:p>
+    <w:p>
+      <w:pPr>
+        <w:pStyle w:val="Normal"/>
+        <w:bidi w:val="0"/>
+        <w:jc w:val="left"/>
+        <w:rPr>
+          <w:lang w:val="en-US"/>
+        </w:rPr>
+      </w:pPr>
+      <w:r>
+        <w:rPr>
+          <w:lang w:val="en-US"/>
+        </w:rPr>
+      </w:r>
+    </w:p>
+    <w:p>
+      <w:pPr>
+        <w:pStyle w:val="Normal"/>
+        <w:bidi w:val="0"/>
+        <w:jc w:val="left"/>
+        <w:rPr>
+          <w:lang w:val="en-US"/>
+        </w:rPr>
+      </w:pPr>
+      <w:r>
+        <w:rPr>
+          <w:lang w:val="en-US"/>
+        </w:rPr>
+        <w:t>@BEGIN ShouldBeInToc</w:t>
+      </w:r>
+    </w:p>
+    <w:p>
+      <w:pPr>
+        <w:pStyle w:val="Normal"/>
+        <w:bidi w:val="0"/>
+        <w:jc w:val="left"/>
+        <w:rPr>
+          <w:lang w:val="en-US"/>
+        </w:rPr>
+      </w:pPr>
+      <w:r>
+        <w:rPr>
+          <w:lang w:val="en-US"/>
+        </w:rPr>
+        <w:t>Абзац должен быть в содержании.</w:t>
       </w:r>
     </w:p>
     <w:p>

</xml_diff>

<commit_message>
add force page break before lint
</commit_message>
<xml_diff>
--- a/WordStyleCheck/rules.docx
+++ b/WordStyleCheck/rules.docx
@@ -2415,6 +2415,69 @@
           <w:lang w:val="en-US"/>
         </w:rPr>
         <w:t>Абзац должен быть в содержании.</w:t>
+      </w:r>
+    </w:p>
+    <w:p>
+      <w:pPr>
+        <w:pStyle w:val="Normal"/>
+        <w:bidi w:val="0"/>
+        <w:jc w:val="left"/>
+        <w:rPr>
+          <w:lang w:val="en-US"/>
+        </w:rPr>
+      </w:pPr>
+      <w:r>
+        <w:rPr>
+          <w:lang w:val="en-US"/>
+        </w:rPr>
+        <w:t>@END</w:t>
+      </w:r>
+    </w:p>
+    <w:p>
+      <w:pPr>
+        <w:pStyle w:val="Normal"/>
+        <w:bidi w:val="0"/>
+        <w:jc w:val="left"/>
+        <w:rPr>
+          <w:lang w:val="en-US"/>
+        </w:rPr>
+      </w:pPr>
+      <w:r>
+        <w:rPr>
+          <w:lang w:val="en-US"/>
+        </w:rPr>
+      </w:r>
+    </w:p>
+    <w:p>
+      <w:pPr>
+        <w:pStyle w:val="Normal"/>
+        <w:bidi w:val="0"/>
+        <w:jc w:val="left"/>
+        <w:rPr>
+          <w:lang w:val="en-US"/>
+        </w:rPr>
+      </w:pPr>
+      <w:r>
+        <w:rPr>
+          <w:lang w:val="en-US"/>
+        </w:rPr>
+        <w:t>@BEGIN NeedsPageBreakBeforeHeader</w:t>
+      </w:r>
+    </w:p>
+    <w:p>
+      <w:pPr>
+        <w:pStyle w:val="Normal"/>
+        <w:bidi w:val="0"/>
+        <w:jc w:val="left"/>
+        <w:rPr>
+          <w:lang w:val="en-US"/>
+        </w:rPr>
+      </w:pPr>
+      <w:r>
+        <w:rPr>
+          <w:lang w:val="en-US"/>
+        </w:rPr>
+        <w:t>Перед заголовками структурных элементов и разделов должен быть разрыв страницы.</w:t>
       </w:r>
     </w:p>
     <w:p>

</xml_diff>